<commit_message>
Actualizado antes de las pruebas sinteticas
</commit_message>
<xml_diff>
--- a/BaseConocimiento/Tecnologico/CONTABILIDAD Y ASESORIA TRIBUTARIA.docx
+++ b/BaseConocimiento/Tecnologico/CONTABILIDAD Y ASESORIA TRIBUTARIA.docx
@@ -111,42 +111,65 @@
           <w:bCs w:val="1"/>
         </w:rPr>
       </w:pPr>
-      <w:bookmarkStart w:colFirst="0" w:colLast="0" w:name="_heading=h.kqkejna9me0z" w:id="0"/>
+      <w:bookmarkStart w:colFirst="0" w:colLast="0" w:name="_heading=h.5vff9tme2a33" w:id="0"/>
       <w:bookmarkEnd w:id="0"/>
       <w:r>
         <w:rPr>
-          <w:rtl w:val="0"/>
-        </w:rPr>
-      </w:r>
-    </w:p>
-    <w:p>
-      <w:pPr>
-        <w:rPr>
-          <w:b w:val="1"/>
-          <w:bCs w:val="1"/>
-        </w:rPr>
-      </w:pPr>
-      <w:r>
-        <w:rPr>
-          <w:b w:val="1"/>
-          <w:bCs w:val="1"/>
-          <w:rtl w:val="0"/>
-        </w:rPr>
-        <w:t xml:space="preserve">DESCRIPCION DE LA CARRERA</w:t>
-      </w:r>
-    </w:p>
-    <w:p>
-      <w:pPr>
-        <w:rPr/>
-      </w:pPr>
+          <w:b w:val="1"/>
+          <w:bCs w:val="1"/>
+          <w:rtl w:val="0"/>
+        </w:rPr>
+        <w:t xml:space="preserve">DESCRIPCIÓN DE LA CARRERA</w:t>
+      </w:r>
+    </w:p>
+    <w:p>
+      <w:pPr>
+        <w:rPr/>
+      </w:pPr>
+      <w:bookmarkStart w:colFirst="0" w:colLast="0" w:name="_heading=h.kqkejna9me0z" w:id="1"/>
+      <w:bookmarkEnd w:id="1"/>
+      <w:r>
+        <w:rPr>
+          <w:rtl w:val="0"/>
+        </w:rPr>
+        <w:t xml:space="preserve">La carrera está orientada a la formación de profesionales capaces de gestionar y analizar información contable y financiera, aplicando normas, principios y buenas prácticas que contribuyan a la correcta toma de decisiones en las organizaciones.</w:t>
+      </w:r>
+    </w:p>
+    <w:p>
+      <w:pPr>
+        <w:rPr>
+          <w:b w:val="1"/>
+          <w:bCs w:val="1"/>
+        </w:rPr>
+      </w:pPr>
+      <w:bookmarkStart w:colFirst="0" w:colLast="0" w:name="_heading=h.1enwiimei8q7" w:id="2"/>
+      <w:bookmarkEnd w:id="2"/>
+      <w:r>
+        <w:rPr>
+          <w:b w:val="1"/>
+          <w:bCs w:val="1"/>
+          <w:rtl w:val="0"/>
+        </w:rPr>
+        <w:t xml:space="preserve">HERRAMIENTAS - BENEFICIOS DE LA CARRERA</w:t>
+      </w:r>
+    </w:p>
+    <w:p>
+      <w:pPr>
+        <w:rPr/>
+      </w:pPr>
+      <w:bookmarkStart w:colFirst="0" w:colLast="0" w:name="_heading=h.78jn8zfg6myd" w:id="3"/>
+      <w:bookmarkEnd w:id="3"/>
       <w:r>
         <w:rPr>
           <w:rtl w:val="0"/>
         </w:rPr>
         <w:t xml:space="preserve">En esta carrera tendrás la oportunidad de formarte con herramientas contables y tecnológicas de vanguardia, aplicando normas y buenas prácticas que aseguren información financiera confiable y oportuna. Nuestro compromiso es acompañarte en tu proceso de aprendizaje para que desarrolles tus competencias profesionales y te prepares para liderar con excelencia en el ámbito económico-financiero.</w:t>
-        <w:br w:type="textWrapping"/>
-        <w:br w:type="textWrapping"/>
-      </w:r>
+      </w:r>
+    </w:p>
+    <w:p>
+      <w:pPr>
+        <w:rPr/>
+      </w:pPr>
       <w:r>
         <w:rPr>
           <w:b w:val="1"/>
@@ -548,13 +571,231 @@
         </w:rPr>
       </w:r>
     </w:p>
+    <w:p>
+      <w:pPr>
+        <w:rPr>
+          <w:b w:val="1"/>
+          <w:bCs w:val="1"/>
+        </w:rPr>
+      </w:pPr>
+      <w:r>
+        <w:rPr>
+          <w:b w:val="1"/>
+          <w:bCs w:val="1"/>
+          <w:rtl w:val="0"/>
+        </w:rPr>
+        <w:t xml:space="preserve">MICROCREDENCIALES</w:t>
+      </w:r>
+    </w:p>
+    <w:p>
+      <w:pPr>
+        <w:spacing w:after="0" w:lineRule="auto"/>
+        <w:ind w:left="0" w:firstLine="0"/>
+        <w:rPr>
+          <w:rFonts w:ascii="Arial" w:cs="Arial" w:eastAsia="Arial" w:hAnsi="Arial"/>
+          <w:color w:val="231f20"/>
+        </w:rPr>
+      </w:pPr>
+      <w:r>
+        <w:rPr>
+          <w:rFonts w:ascii="Arial" w:cs="Arial" w:eastAsia="Arial" w:hAnsi="Arial"/>
+          <w:color w:val="231f20"/>
+          <w:rtl w:val="0"/>
+        </w:rPr>
+        <w:t xml:space="preserve">Otorgamiento de 4 mi crocrendenciales al concluir los dos años de la tecnología, entregando certificaciones digitales por 98 horas, en:</w:t>
+      </w:r>
+    </w:p>
+    <w:p>
+      <w:pPr>
+        <w:spacing w:after="0" w:before="120" w:lineRule="auto"/>
+        <w:ind w:left="0" w:firstLine="0"/>
+        <w:jc w:val="both"/>
+        <w:rPr>
+          <w:rFonts w:ascii="Arial" w:cs="Arial" w:eastAsia="Arial" w:hAnsi="Arial"/>
+          <w:color w:val="231f20"/>
+        </w:rPr>
+      </w:pPr>
+      <w:r>
+        <w:rPr>
+          <w:rFonts w:ascii="Arial" w:cs="Arial" w:eastAsia="Arial" w:hAnsi="Arial"/>
+          <w:color w:val="231f20"/>
+          <w:rtl w:val="0"/>
+        </w:rPr>
+        <w:t xml:space="preserve">-</w:t>
+      </w:r>
+      <w:r>
+        <w:rPr>
+          <w:rFonts w:ascii="Times New Roman" w:cs="Times New Roman" w:eastAsia="Times New Roman" w:hAnsi="Times New Roman"/>
+          <w:color w:val="231f20"/>
+          <w:sz w:val="14"/>
+          <w:szCs w:val="14"/>
+          <w:rtl w:val="0"/>
+        </w:rPr>
+        <w:t xml:space="preserve">       </w:t>
+      </w:r>
+      <w:r>
+        <w:rPr>
+          <w:rFonts w:ascii="Arial" w:cs="Arial" w:eastAsia="Arial" w:hAnsi="Arial"/>
+          <w:color w:val="231f20"/>
+          <w:rtl w:val="0"/>
+        </w:rPr>
+        <w:t xml:space="preserve">Certificación en auxiliar contable y tributario para MIPYMES (nivel inicial).</w:t>
+      </w:r>
+    </w:p>
+    <w:p>
+      <w:pPr>
+        <w:spacing w:after="0" w:before="120" w:lineRule="auto"/>
+        <w:ind w:left="0" w:firstLine="0"/>
+        <w:jc w:val="both"/>
+        <w:rPr>
+          <w:rFonts w:ascii="Arial" w:cs="Arial" w:eastAsia="Arial" w:hAnsi="Arial"/>
+          <w:color w:val="231f20"/>
+        </w:rPr>
+      </w:pPr>
+      <w:r>
+        <w:rPr>
+          <w:rFonts w:ascii="Arial" w:cs="Arial" w:eastAsia="Arial" w:hAnsi="Arial"/>
+          <w:color w:val="231f20"/>
+          <w:rtl w:val="0"/>
+        </w:rPr>
+        <w:t xml:space="preserve">-</w:t>
+      </w:r>
+      <w:r>
+        <w:rPr>
+          <w:rFonts w:ascii="Times New Roman" w:cs="Times New Roman" w:eastAsia="Times New Roman" w:hAnsi="Times New Roman"/>
+          <w:color w:val="231f20"/>
+          <w:sz w:val="14"/>
+          <w:szCs w:val="14"/>
+          <w:rtl w:val="0"/>
+        </w:rPr>
+        <w:t xml:space="preserve">       </w:t>
+      </w:r>
+      <w:r>
+        <w:rPr>
+          <w:rFonts w:ascii="Arial" w:cs="Arial" w:eastAsia="Arial" w:hAnsi="Arial"/>
+          <w:color w:val="231f20"/>
+          <w:rtl w:val="0"/>
+        </w:rPr>
+        <w:t xml:space="preserve">Certificación en auxiliar contable y tributario para MIPYMES (nivel superior).</w:t>
+      </w:r>
+    </w:p>
+    <w:p>
+      <w:pPr>
+        <w:spacing w:after="0" w:before="120" w:lineRule="auto"/>
+        <w:ind w:left="0" w:firstLine="0"/>
+        <w:jc w:val="both"/>
+        <w:rPr>
+          <w:rFonts w:ascii="Arial" w:cs="Arial" w:eastAsia="Arial" w:hAnsi="Arial"/>
+          <w:color w:val="231f20"/>
+        </w:rPr>
+      </w:pPr>
+      <w:r>
+        <w:rPr>
+          <w:rFonts w:ascii="Arial" w:cs="Arial" w:eastAsia="Arial" w:hAnsi="Arial"/>
+          <w:color w:val="231f20"/>
+          <w:rtl w:val="0"/>
+        </w:rPr>
+        <w:t xml:space="preserve">-</w:t>
+      </w:r>
+      <w:r>
+        <w:rPr>
+          <w:rFonts w:ascii="Times New Roman" w:cs="Times New Roman" w:eastAsia="Times New Roman" w:hAnsi="Times New Roman"/>
+          <w:color w:val="231f20"/>
+          <w:sz w:val="14"/>
+          <w:szCs w:val="14"/>
+          <w:rtl w:val="0"/>
+        </w:rPr>
+        <w:t xml:space="preserve">       </w:t>
+      </w:r>
+      <w:r>
+        <w:rPr>
+          <w:rFonts w:ascii="Arial" w:cs="Arial" w:eastAsia="Arial" w:hAnsi="Arial"/>
+          <w:color w:val="231f20"/>
+          <w:rtl w:val="0"/>
+        </w:rPr>
+        <w:t xml:space="preserve">Certificación en gestor de costos, presupuestos y cumplimiento empresarial.</w:t>
+      </w:r>
+    </w:p>
+    <w:p>
+      <w:pPr>
+        <w:spacing w:after="0" w:before="120" w:lineRule="auto"/>
+        <w:ind w:left="0" w:firstLine="0"/>
+        <w:jc w:val="both"/>
+        <w:rPr>
+          <w:rFonts w:ascii="Arial" w:cs="Arial" w:eastAsia="Arial" w:hAnsi="Arial"/>
+          <w:color w:val="231f20"/>
+        </w:rPr>
+      </w:pPr>
+      <w:r>
+        <w:rPr>
+          <w:rFonts w:ascii="Arial" w:cs="Arial" w:eastAsia="Arial" w:hAnsi="Arial"/>
+          <w:color w:val="231f20"/>
+          <w:rtl w:val="0"/>
+        </w:rPr>
+        <w:t xml:space="preserve">-</w:t>
+      </w:r>
+      <w:r>
+        <w:rPr>
+          <w:rFonts w:ascii="Times New Roman" w:cs="Times New Roman" w:eastAsia="Times New Roman" w:hAnsi="Times New Roman"/>
+          <w:color w:val="231f20"/>
+          <w:sz w:val="14"/>
+          <w:szCs w:val="14"/>
+          <w:rtl w:val="0"/>
+        </w:rPr>
+        <w:t xml:space="preserve">       </w:t>
+      </w:r>
+      <w:r>
+        <w:rPr>
+          <w:rFonts w:ascii="Arial" w:cs="Arial" w:eastAsia="Arial" w:hAnsi="Arial"/>
+          <w:color w:val="231f20"/>
+          <w:rtl w:val="0"/>
+        </w:rPr>
+        <w:t xml:space="preserve">Certificación en evaluación financiera y toma de decisiones basada en datos.</w:t>
+      </w:r>
+    </w:p>
+    <w:p>
+      <w:pPr>
+        <w:rPr/>
+      </w:pPr>
+      <w:r>
+        <w:rPr>
+          <w:rtl w:val="0"/>
+        </w:rPr>
+      </w:r>
+    </w:p>
+    <w:p>
+      <w:pPr>
+        <w:rPr/>
+      </w:pPr>
+      <w:r>
+        <w:rPr>
+          <w:rtl w:val="0"/>
+        </w:rPr>
+      </w:r>
+    </w:p>
     <w:sectPr>
+      <w:headerReference r:id="rId7" w:type="default"/>
       <w:pgSz w:h="15840" w:w="12240" w:orient="portrait"/>
       <w:pgMar w:bottom="1417" w:top="1417" w:left="1701" w:right="1701" w:header="708" w:footer="708"/>
       <w:pgNumType w:start="1"/>
     </w:sectPr>
   </w:body>
 </w:document>
+</file>
+
+<file path=word/header1.xml><?xml version="1.0" encoding="utf-8"?>
+<w:hdr xmlns:mc="http://schemas.openxmlformats.org/markup-compatibility/2006" xmlns:o="urn:schemas-microsoft-com:office:office" xmlns:r="http://schemas.openxmlformats.org/officeDocument/2006/relationships" xmlns:m="http://schemas.openxmlformats.org/officeDocument/2006/math" xmlns:v="urn:schemas-microsoft-com:vml" xmlns:wp="http://schemas.openxmlformats.org/drawingml/2006/wordprocessingDrawing" xmlns:w10="urn:schemas-microsoft-com:office:word" xmlns:w="http://schemas.openxmlformats.org/wordprocessingml/2006/main" xmlns:wne="http://schemas.microsoft.com/office/word/2006/wordml" xmlns:sl="http://schemas.openxmlformats.org/schemaLibrary/2006/main" xmlns:a="http://schemas.openxmlformats.org/drawingml/2006/main" xmlns:pic="http://schemas.openxmlformats.org/drawingml/2006/picture" xmlns:c="http://schemas.openxmlformats.org/drawingml/2006/chart" xmlns:lc="http://schemas.openxmlformats.org/drawingml/2006/lockedCanvas" xmlns:dgm="http://schemas.openxmlformats.org/drawingml/2006/diagram" xmlns:wps="http://schemas.microsoft.com/office/word/2010/wordprocessingShape" xmlns:wpg="http://schemas.microsoft.com/office/word/2010/wordprocessingGroup" xmlns:w14="http://schemas.microsoft.com/office/word/2010/wordml" xmlns:w15="http://schemas.microsoft.com/office/word/2012/wordml" xmlns:w16="http://schemas.microsoft.com/office/word/2018/wordml" xmlns:w16cex="http://schemas.microsoft.com/office/word/2018/wordml/cex" xmlns:w16cid="http://schemas.microsoft.com/office/word/2016/wordml/cid" xmlns="http://schemas.microsoft.com/office/tasks/2019/documenttasks" xmlns:cr="http://schemas.microsoft.com/office/comments/2020/reactions">
+  <w:p>
+    <w:pPr>
+      <w:rPr/>
+    </w:pPr>
+    <w:r>
+      <w:rPr>
+        <w:rtl w:val="0"/>
+      </w:rPr>
+    </w:r>
+  </w:p>
+</w:hdr>
 </file>
 
 <file path=word/numbering.xml><?xml version="1.0" encoding="utf-8"?>
@@ -1055,7 +1296,7 @@
 
 <file path=customXML/item1.xml><?xml version="1.0" encoding="utf-8"?>
 <go:gDocsCustomXmlDataStorage xmlns:go="http://customooxmlschemas.google.com/" xmlns:r="http://schemas.openxmlformats.org/officeDocument/2006/relationships" uri="GoogleDocsCustomDataVersion2">
-  <go:docsCustomData xmlns:go="http://customooxmlschemas.google.com/" roundtripDataSignature="AMtx7mj9nx/WLN6qs12cadxRbJQYD5CE0Q==">CgMxLjAyDmgua3FrZWpuYTltZTB6OAByITEyWXZ4WjVIYU5NY1V4dHAwNTdaMjRtSjZwdlotaHRaSg==</go:docsCustomData>
+  <go:docsCustomData xmlns:go="http://customooxmlschemas.google.com/" roundtripDataSignature="AMtx7mjqkzilwLtAQljaFBBCca2IJ+9quA==">CgMxLjAyDmguNXZmZjl0bWUyYTMzMg5oLmtxa2VqbmE5bWUwejIOaC4xZW53aWltZWk4cTcyDmguNzhqbjh6Zmc2bXlkOAByITF2cjNRQTZFX1MtcGwyQVJKdlVDdWVxYWxhYkg0cTRpRQ==</go:docsCustomData>
 </go:gDocsCustomXmlDataStorage>
 </file>
 

</xml_diff>